<commit_message>
feat(documents): make document generation production ready
</commit_message>
<xml_diff>
--- a/public/templates/Attestation de Réception des Clés.docx
+++ b/public/templates/Attestation de Réception des Clés.docx
@@ -1,744 +1,505 @@
 
 <file path=word/document.xml><?xml version="1.0" encoding="utf-8"?>
-<w:document xmlns:wpc="http://schemas.microsoft.com/office/word/2010/wordprocessingCanvas" xmlns:cx="http://schemas.microsoft.com/office/drawing/2014/chartex" xmlns:cx1="http://schemas.microsoft.com/office/drawing/2015/9/8/chartex" xmlns:cx2="http://schemas.microsoft.com/office/drawing/2015/10/21/chartex" xmlns:cx3="http://schemas.microsoft.com/office/drawing/2016/5/9/chartex" xmlns:cx4="http://schemas.microsoft.com/office/drawing/2016/5/10/chartex" xmlns:cx5="http://schemas.microsoft.com/office/drawing/2016/5/11/chartex" xmlns:cx6="http://schemas.microsoft.com/office/drawing/2016/5/12/chartex" xmlns:cx7="http://schemas.microsoft.com/office/drawing/2016/5/13/chartex" xmlns:cx8="http://schemas.microsoft.com/office/drawing/2016/5/14/chartex" xmlns:mc="http://schemas.openxmlformats.org/markup-compatibility/2006" xmlns:aink="http://schemas.microsoft.com/office/drawing/2016/ink" xmlns:am3d="http://schemas.microsoft.com/office/drawing/2017/model3d" xmlns:o="urn:schemas-microsoft-com:office:office" xmlns:oel="http://schemas.microsoft.com/office/2019/extlst" xmlns:r="http://schemas.openxmlformats.org/officeDocument/2006/relationships" xmlns:m="http://schemas.openxmlformats.org/officeDocument/2006/math" xmlns:v="urn:schemas-microsoft-com:vml" xmlns:wp14="http://schemas.microsoft.com/office/word/2010/wordprocessingDrawing" xmlns:wp="http://schemas.openxmlformats.org/drawingml/2006/wordprocessingDrawing" xmlns:w10="urn:schemas-microsoft-com:office:word" xmlns:w="http://schemas.openxmlformats.org/wordprocessingml/2006/main" xmlns:w14="http://schemas.microsoft.com/office/word/2010/wordml" xmlns:w15="http://schemas.microsoft.com/office/word/2012/wordml" xmlns:w16cex="http://schemas.microsoft.com/office/word/2018/wordml/cex" xmlns:w16cid="http://schemas.microsoft.com/office/word/2016/wordml/cid" xmlns:w16="http://schemas.microsoft.com/office/word/2018/wordml" xmlns:w16du="http://schemas.microsoft.com/office/word/2023/wordml/word16du" xmlns:w16sdtdh="http://schemas.microsoft.com/office/word/2020/wordml/sdtdatahash" xmlns:w16sdtfl="http://schemas.microsoft.com/office/word/2024/wordml/sdtformatlock" xmlns:w16se="http://schemas.microsoft.com/office/word/2015/wordml/symex" xmlns:wpg="http://schemas.microsoft.com/office/word/2010/wordprocessingGroup" xmlns:wpi="http://schemas.microsoft.com/office/word/2010/wordprocessingInk" xmlns:wne="http://schemas.microsoft.com/office/word/2006/wordml" xmlns:wps="http://schemas.microsoft.com/office/word/2010/wordprocessingShape" mc:Ignorable="w14 w15 w16se w16cid w16 w16cex w16sdtdh w16sdtfl w16du wp14">
+<w:document xmlns:w="http://schemas.openxmlformats.org/wordprocessingml/2006/main">
   <w:body>
-    <w:p/>
     <w:p>
       <w:pPr>
-        <w:jc w:val="right"/>
-        <w:rPr>
-          <w:sz w:val="24"/>
-        </w:rPr>
+        <w:jc w:val="center"/>
+        <w:spacing w:after="120"/>
       </w:pPr>
       <w:r>
         <w:rPr>
-          <w:sz w:val="24"/>
+          <w:rFonts w:ascii="Arial" w:hAnsi="Arial"/>
+          <w:sz w:val="21"/>
+          <w:b/>
+          <w:color w:val="234F7C"/>
+          <w:sz w:val="22"/>
         </w:rPr>
-        <w:t xml:space="preserve">                                                 </w:t>
+        <w:t xml:space="preserve">PYRAMIDE IMMOBILIER</w:t>
       </w:r>
     </w:p>
     <w:p>
       <w:pPr>
-        <w:jc w:val="right"/>
-        <w:rPr>
-          <w:b/>
-          <w:sz w:val="24"/>
-        </w:rPr>
+        <w:jc w:val="center"/>
+        <w:spacing w:before="120" w:after="240"/>
+        <w:spacing w:after="120"/>
       </w:pPr>
       <w:r>
         <w:rPr>
+          <w:rFonts w:ascii="Arial" w:hAnsi="Arial"/>
+          <w:sz w:val="21"/>
           <w:b/>
-          <w:sz w:val="24"/>
+          <w:sz w:val="32"/>
         </w:rPr>
-        <w:t xml:space="preserve">                 </w:t>
+        <w:t xml:space="preserve">Attestation de réception des clés</w:t>
       </w:r>
     </w:p>
     <w:p>
       <w:pPr>
-        <w:jc w:val="right"/>
-        <w:rPr>
-          <w:b/>
-          <w:sz w:val="24"/>
-        </w:rPr>
+        <w:jc w:val="both"/>
+        <w:spacing w:after="120"/>
       </w:pPr>
       <w:r>
         <w:rPr>
-          <w:b/>
-          <w:sz w:val="24"/>
+          <w:rFonts w:ascii="Arial" w:hAnsi="Arial"/>
+          <w:sz w:val="21"/>
         </w:rPr>
-        <w:t xml:space="preserve">   </w:t>
+        <w:t xml:space="preserve">Le client reconnaît avoir reçu les clés du bien désigné ci-dessous et s’engage à les restituer selon les conditions convenues.</w:t>
       </w:r>
     </w:p>
+    <w:tbl>
+      <w:tblPr>
+        <w:tblW w:w="9700" w:type="dxa"/>
+        <w:tblLayout w:type="fixed"/>
+        <w:tblBorders>
+          <w:top w:val="single" w:sz="4" w:color="D9D9D9"/>
+          <w:left w:val="single" w:sz="4" w:color="D9D9D9"/>
+          <w:bottom w:val="single" w:sz="4" w:color="D9D9D9"/>
+          <w:right w:val="single" w:sz="4" w:color="D9D9D9"/>
+          <w:insideH w:val="single" w:sz="4" w:color="D9D9D9"/>
+          <w:insideV w:val="single" w:sz="4" w:color="D9D9D9"/>
+        </w:tblBorders>
+      </w:tblPr>
+      <w:tblGrid>
+        <w:gridCol w:w="3200"/>
+        <w:gridCol w:w="6500"/>
+      </w:tblGrid>
+      <w:tr>
+        <w:tc>
+          <w:tcPr>
+            <w:tcW w:w="3200" w:type="dxa"/>
+            <w:tcMar>
+              <w:top w:w="100" w:type="dxa"/>
+              <w:left w:w="120" w:type="dxa"/>
+              <w:bottom w:w="100" w:type="dxa"/>
+              <w:right w:w="120" w:type="dxa"/>
+            </w:tcMar>
+            <w:vAlign w:val="center"/>
+          </w:tcPr>
+          <w:p>
+            <w:pPr>
+              <w:spacing w:after="120"/>
+            </w:pPr>
+            <w:r>
+              <w:rPr>
+                <w:rFonts w:ascii="Arial" w:hAnsi="Arial"/>
+                <w:sz w:val="21"/>
+                <w:b/>
+              </w:rPr>
+              <w:t xml:space="preserve">Date</w:t>
+            </w:r>
+          </w:p>
+        </w:tc>
+        <w:tc>
+          <w:tcPr>
+            <w:tcW w:w="6500" w:type="dxa"/>
+            <w:tcMar>
+              <w:top w:w="100" w:type="dxa"/>
+              <w:left w:w="120" w:type="dxa"/>
+              <w:bottom w:w="100" w:type="dxa"/>
+              <w:right w:w="120" w:type="dxa"/>
+            </w:tcMar>
+            <w:vAlign w:val="center"/>
+          </w:tcPr>
+          <w:p>
+            <w:pPr>
+              <w:spacing w:after="120"/>
+            </w:pPr>
+            <w:r>
+              <w:rPr>
+                <w:rFonts w:ascii="Arial" w:hAnsi="Arial"/>
+                <w:sz w:val="21"/>
+              </w:rPr>
+              <w:t xml:space="preserve">{{DATE}}</w:t>
+            </w:r>
+          </w:p>
+        </w:tc>
+      </w:tr>
+      <w:tr>
+        <w:tc>
+          <w:tcPr>
+            <w:tcW w:w="3200" w:type="dxa"/>
+            <w:tcMar>
+              <w:top w:w="100" w:type="dxa"/>
+              <w:left w:w="120" w:type="dxa"/>
+              <w:bottom w:w="100" w:type="dxa"/>
+              <w:right w:w="120" w:type="dxa"/>
+            </w:tcMar>
+            <w:vAlign w:val="center"/>
+          </w:tcPr>
+          <w:p>
+            <w:pPr>
+              <w:spacing w:after="120"/>
+            </w:pPr>
+            <w:r>
+              <w:rPr>
+                <w:rFonts w:ascii="Arial" w:hAnsi="Arial"/>
+                <w:sz w:val="21"/>
+                <w:b/>
+              </w:rPr>
+              <w:t xml:space="preserve">Client</w:t>
+            </w:r>
+          </w:p>
+        </w:tc>
+        <w:tc>
+          <w:tcPr>
+            <w:tcW w:w="6500" w:type="dxa"/>
+            <w:tcMar>
+              <w:top w:w="100" w:type="dxa"/>
+              <w:left w:w="120" w:type="dxa"/>
+              <w:bottom w:w="100" w:type="dxa"/>
+              <w:right w:w="120" w:type="dxa"/>
+            </w:tcMar>
+            <w:vAlign w:val="center"/>
+          </w:tcPr>
+          <w:p>
+            <w:pPr>
+              <w:spacing w:after="120"/>
+            </w:pPr>
+            <w:r>
+              <w:rPr>
+                <w:rFonts w:ascii="Arial" w:hAnsi="Arial"/>
+                <w:sz w:val="21"/>
+              </w:rPr>
+              <w:t xml:space="preserve">{{CLIENT_NAME}}</w:t>
+            </w:r>
+          </w:p>
+        </w:tc>
+      </w:tr>
+      <w:tr>
+        <w:tc>
+          <w:tcPr>
+            <w:tcW w:w="3200" w:type="dxa"/>
+            <w:tcMar>
+              <w:top w:w="100" w:type="dxa"/>
+              <w:left w:w="120" w:type="dxa"/>
+              <w:bottom w:w="100" w:type="dxa"/>
+              <w:right w:w="120" w:type="dxa"/>
+            </w:tcMar>
+            <w:vAlign w:val="center"/>
+          </w:tcPr>
+          <w:p>
+            <w:pPr>
+              <w:spacing w:after="120"/>
+            </w:pPr>
+            <w:r>
+              <w:rPr>
+                <w:rFonts w:ascii="Arial" w:hAnsi="Arial"/>
+                <w:sz w:val="21"/>
+                <w:b/>
+              </w:rPr>
+              <w:t xml:space="preserve">Bien</w:t>
+            </w:r>
+          </w:p>
+        </w:tc>
+        <w:tc>
+          <w:tcPr>
+            <w:tcW w:w="6500" w:type="dxa"/>
+            <w:tcMar>
+              <w:top w:w="100" w:type="dxa"/>
+              <w:left w:w="120" w:type="dxa"/>
+              <w:bottom w:w="100" w:type="dxa"/>
+              <w:right w:w="120" w:type="dxa"/>
+            </w:tcMar>
+            <w:vAlign w:val="center"/>
+          </w:tcPr>
+          <w:p>
+            <w:pPr>
+              <w:spacing w:after="120"/>
+            </w:pPr>
+            <w:r>
+              <w:rPr>
+                <w:rFonts w:ascii="Arial" w:hAnsi="Arial"/>
+                <w:sz w:val="21"/>
+              </w:rPr>
+              <w:t xml:space="preserve">{{PROPERTY_TYPE}}</w:t>
+            </w:r>
+          </w:p>
+        </w:tc>
+      </w:tr>
+      <w:tr>
+        <w:tc>
+          <w:tcPr>
+            <w:tcW w:w="3200" w:type="dxa"/>
+            <w:tcMar>
+              <w:top w:w="100" w:type="dxa"/>
+              <w:left w:w="120" w:type="dxa"/>
+              <w:bottom w:w="100" w:type="dxa"/>
+              <w:right w:w="120" w:type="dxa"/>
+            </w:tcMar>
+            <w:vAlign w:val="center"/>
+          </w:tcPr>
+          <w:p>
+            <w:pPr>
+              <w:spacing w:after="120"/>
+            </w:pPr>
+            <w:r>
+              <w:rPr>
+                <w:rFonts w:ascii="Arial" w:hAnsi="Arial"/>
+                <w:sz w:val="21"/>
+                <w:b/>
+              </w:rPr>
+              <w:t xml:space="preserve">Adresse</w:t>
+            </w:r>
+          </w:p>
+        </w:tc>
+        <w:tc>
+          <w:tcPr>
+            <w:tcW w:w="6500" w:type="dxa"/>
+            <w:tcMar>
+              <w:top w:w="100" w:type="dxa"/>
+              <w:left w:w="120" w:type="dxa"/>
+              <w:bottom w:w="100" w:type="dxa"/>
+              <w:right w:w="120" w:type="dxa"/>
+            </w:tcMar>
+            <w:vAlign w:val="center"/>
+          </w:tcPr>
+          <w:p>
+            <w:pPr>
+              <w:spacing w:after="120"/>
+            </w:pPr>
+            <w:r>
+              <w:rPr>
+                <w:rFonts w:ascii="Arial" w:hAnsi="Arial"/>
+                <w:sz w:val="21"/>
+              </w:rPr>
+              <w:t xml:space="preserve">{{PROPERTY_ADDRESS}}</w:t>
+            </w:r>
+          </w:p>
+        </w:tc>
+      </w:tr>
+      <w:tr>
+        <w:tc>
+          <w:tcPr>
+            <w:tcW w:w="3200" w:type="dxa"/>
+            <w:tcMar>
+              <w:top w:w="100" w:type="dxa"/>
+              <w:left w:w="120" w:type="dxa"/>
+              <w:bottom w:w="100" w:type="dxa"/>
+              <w:right w:w="120" w:type="dxa"/>
+            </w:tcMar>
+            <w:vAlign w:val="center"/>
+          </w:tcPr>
+          <w:p>
+            <w:pPr>
+              <w:spacing w:after="120"/>
+            </w:pPr>
+            <w:r>
+              <w:rPr>
+                <w:rFonts w:ascii="Arial" w:hAnsi="Arial"/>
+                <w:sz w:val="21"/>
+                <w:b/>
+              </w:rPr>
+              <w:t xml:space="preserve">Détails</w:t>
+            </w:r>
+          </w:p>
+        </w:tc>
+        <w:tc>
+          <w:tcPr>
+            <w:tcW w:w="6500" w:type="dxa"/>
+            <w:tcMar>
+              <w:top w:w="100" w:type="dxa"/>
+              <w:left w:w="120" w:type="dxa"/>
+              <w:bottom w:w="100" w:type="dxa"/>
+              <w:right w:w="120" w:type="dxa"/>
+            </w:tcMar>
+            <w:vAlign w:val="center"/>
+          </w:tcPr>
+          <w:p>
+            <w:pPr>
+              <w:spacing w:after="120"/>
+            </w:pPr>
+            <w:r>
+              <w:rPr>
+                <w:rFonts w:ascii="Arial" w:hAnsi="Arial"/>
+                <w:sz w:val="21"/>
+              </w:rPr>
+              <w:t xml:space="preserve">{{PROPERTY_DETAILS}}</w:t>
+            </w:r>
+          </w:p>
+        </w:tc>
+      </w:tr>
+      <w:tr>
+        <w:tc>
+          <w:tcPr>
+            <w:tcW w:w="3200" w:type="dxa"/>
+            <w:tcMar>
+              <w:top w:w="100" w:type="dxa"/>
+              <w:left w:w="120" w:type="dxa"/>
+              <w:bottom w:w="100" w:type="dxa"/>
+              <w:right w:w="120" w:type="dxa"/>
+            </w:tcMar>
+            <w:vAlign w:val="center"/>
+          </w:tcPr>
+          <w:p>
+            <w:pPr>
+              <w:spacing w:after="120"/>
+            </w:pPr>
+            <w:r>
+              <w:rPr>
+                <w:rFonts w:ascii="Arial" w:hAnsi="Arial"/>
+                <w:sz w:val="21"/>
+                <w:b/>
+              </w:rPr>
+              <w:t xml:space="preserve">Remise par</w:t>
+            </w:r>
+          </w:p>
+        </w:tc>
+        <w:tc>
+          <w:tcPr>
+            <w:tcW w:w="6500" w:type="dxa"/>
+            <w:tcMar>
+              <w:top w:w="100" w:type="dxa"/>
+              <w:left w:w="120" w:type="dxa"/>
+              <w:bottom w:w="100" w:type="dxa"/>
+              <w:right w:w="120" w:type="dxa"/>
+            </w:tcMar>
+            <w:vAlign w:val="center"/>
+          </w:tcPr>
+          <w:p>
+            <w:pPr>
+              <w:spacing w:after="120"/>
+            </w:pPr>
+            <w:r>
+              <w:rPr>
+                <w:rFonts w:ascii="Arial" w:hAnsi="Arial"/>
+                <w:sz w:val="21"/>
+              </w:rPr>
+              <w:t xml:space="preserve">{{REMITTER_NAME}}</w:t>
+            </w:r>
+          </w:p>
+        </w:tc>
+      </w:tr>
+      <w:tr>
+        <w:tc>
+          <w:tcPr>
+            <w:tcW w:w="3200" w:type="dxa"/>
+            <w:tcMar>
+              <w:top w:w="100" w:type="dxa"/>
+              <w:left w:w="120" w:type="dxa"/>
+              <w:bottom w:w="100" w:type="dxa"/>
+              <w:right w:w="120" w:type="dxa"/>
+            </w:tcMar>
+            <w:vAlign w:val="center"/>
+          </w:tcPr>
+          <w:p>
+            <w:pPr>
+              <w:spacing w:after="120"/>
+            </w:pPr>
+            <w:r>
+              <w:rPr>
+                <w:rFonts w:ascii="Arial" w:hAnsi="Arial"/>
+                <w:sz w:val="21"/>
+                <w:b/>
+              </w:rPr>
+              <w:t xml:space="preserve">Agent responsable</w:t>
+            </w:r>
+          </w:p>
+        </w:tc>
+        <w:tc>
+          <w:tcPr>
+            <w:tcW w:w="6500" w:type="dxa"/>
+            <w:tcMar>
+              <w:top w:w="100" w:type="dxa"/>
+              <w:left w:w="120" w:type="dxa"/>
+              <w:bottom w:w="100" w:type="dxa"/>
+              <w:right w:w="120" w:type="dxa"/>
+            </w:tcMar>
+            <w:vAlign w:val="center"/>
+          </w:tcPr>
+          <w:p>
+            <w:pPr>
+              <w:spacing w:after="120"/>
+            </w:pPr>
+            <w:r>
+              <w:rPr>
+                <w:rFonts w:ascii="Arial" w:hAnsi="Arial"/>
+                <w:sz w:val="21"/>
+              </w:rPr>
+              <w:t xml:space="preserve">{{AGENT_NAME}}</w:t>
+            </w:r>
+          </w:p>
+        </w:tc>
+      </w:tr>
+    </w:tbl>
     <w:p>
       <w:pPr>
-        <w:jc w:val="right"/>
-        <w:rPr>
-          <w:b/>
-          <w:sz w:val="24"/>
-        </w:rPr>
+        <w:spacing w:after="120"/>
       </w:pPr>
       <w:r>
         <w:rPr>
-          <w:b/>
-          <w:sz w:val="24"/>
+          <w:rFonts w:ascii="Arial" w:hAnsi="Arial"/>
+          <w:sz w:val="21"/>
         </w:rPr>
-        <w:t>Oran, le</w:t>
-      </w:r>
-      <w:r>
-        <w:rPr>
-          <w:sz w:val="24"/>
-        </w:rPr>
-        <w:t xml:space="preserve"> </w:t>
-      </w:r>
-      <w:r>
-        <w:rPr>
-          <w:b/>
-        </w:rPr>
-        <w:t>04/12</w:t>
-      </w:r>
-      <w:r>
-        <w:rPr>
-          <w:b/>
-        </w:rPr>
-        <w:t>/25</w:t>
+        <w:t xml:space="preserve"/>
       </w:r>
     </w:p>
-    <w:p>
-      <w:pPr>
-        <w:rPr>
-          <w:b/>
-          <w:sz w:val="24"/>
-        </w:rPr>
-      </w:pPr>
-      <w:r>
-        <w:rPr>
-          <w:b/>
-          <w:sz w:val="24"/>
-        </w:rPr>
-        <w:t>RC : 31/00-5630527 A 24</w:t>
-      </w:r>
-    </w:p>
-    <w:p>
-      <w:pPr>
-        <w:rPr>
-          <w:b/>
-          <w:sz w:val="24"/>
-        </w:rPr>
-      </w:pPr>
-      <w:r>
-        <w:rPr>
-          <w:b/>
-          <w:sz w:val="24"/>
-        </w:rPr>
-        <w:t xml:space="preserve">633 </w:t>
-      </w:r>
-      <w:proofErr w:type="gramStart"/>
-      <w:r>
-        <w:rPr>
-          <w:b/>
-          <w:sz w:val="24"/>
-        </w:rPr>
-        <w:t>cité</w:t>
-      </w:r>
-      <w:proofErr w:type="gramEnd"/>
-      <w:r>
-        <w:rPr>
-          <w:b/>
-          <w:sz w:val="24"/>
-        </w:rPr>
-        <w:t xml:space="preserve"> horizon Bel </w:t>
-      </w:r>
-      <w:proofErr w:type="spellStart"/>
-      <w:r>
-        <w:rPr>
-          <w:b/>
-          <w:sz w:val="24"/>
-        </w:rPr>
-        <w:t>bp</w:t>
-      </w:r>
-      <w:proofErr w:type="spellEnd"/>
-      <w:r>
-        <w:rPr>
-          <w:b/>
-          <w:sz w:val="24"/>
-        </w:rPr>
-        <w:t xml:space="preserve"> 3a N°10 </w:t>
-      </w:r>
-      <w:proofErr w:type="spellStart"/>
-      <w:r>
-        <w:rPr>
-          <w:b/>
-          <w:sz w:val="24"/>
-        </w:rPr>
-        <w:t>bir</w:t>
-      </w:r>
-      <w:proofErr w:type="spellEnd"/>
-      <w:r>
-        <w:rPr>
-          <w:b/>
-          <w:sz w:val="24"/>
-        </w:rPr>
-        <w:t xml:space="preserve"> el </w:t>
-      </w:r>
-      <w:proofErr w:type="spellStart"/>
-      <w:r>
-        <w:rPr>
-          <w:b/>
-          <w:sz w:val="24"/>
-        </w:rPr>
-        <w:t>Djir</w:t>
-      </w:r>
-      <w:proofErr w:type="spellEnd"/>
-      <w:r>
-        <w:rPr>
-          <w:b/>
-          <w:sz w:val="24"/>
-        </w:rPr>
-        <w:t xml:space="preserve"> Oran</w:t>
-      </w:r>
-    </w:p>
-    <w:p>
-      <w:pPr>
-        <w:rPr>
-          <w:b/>
-          <w:sz w:val="24"/>
-        </w:rPr>
-      </w:pPr>
-      <w:r>
-        <w:rPr>
-          <w:b/>
-          <w:sz w:val="24"/>
-        </w:rPr>
-        <w:t>0792 11 65 96/ 0779 07 97 06</w:t>
-      </w:r>
-    </w:p>
-    <w:p>
-      <w:pPr>
-        <w:rPr>
-          <w:b/>
-          <w:sz w:val="24"/>
-        </w:rPr>
-      </w:pPr>
-      <w:r>
-        <w:rPr>
-          <w:b/>
-          <w:sz w:val="24"/>
-        </w:rPr>
-        <w:t>pyramide.immobilier</w:t>
-      </w:r>
-      <w:r>
-        <w:rPr>
-          <w:b/>
-          <w:sz w:val="24"/>
-        </w:rPr>
-        <w:t>31</w:t>
-      </w:r>
-      <w:r>
-        <w:rPr>
-          <w:b/>
-          <w:sz w:val="24"/>
-        </w:rPr>
-        <w:t>@gmail.com</w:t>
-      </w:r>
-    </w:p>
-    <w:p>
-      <w:pPr>
-        <w:rPr>
-          <w:b/>
-          <w:sz w:val="24"/>
-        </w:rPr>
-      </w:pPr>
-    </w:p>
-    <w:p>
-      <w:pPr>
-        <w:pStyle w:val="NormalWeb"/>
-        <w:pBdr>
-          <w:top w:val="single" w:sz="2" w:space="0" w:color="E3E3E3"/>
-          <w:left w:val="single" w:sz="2" w:space="0" w:color="E3E3E3"/>
-          <w:bottom w:val="single" w:sz="2" w:space="0" w:color="E3E3E3"/>
-          <w:right w:val="single" w:sz="2" w:space="0" w:color="E3E3E3"/>
-        </w:pBdr>
-        <w:shd w:val="clear" w:color="auto" w:fill="FFFFFF"/>
-        <w:spacing w:before="300" w:beforeAutospacing="0" w:after="300" w:afterAutospacing="0"/>
-        <w:jc w:val="center"/>
-        <w:rPr>
-          <w:rFonts w:ascii="Segoe UI" w:hAnsi="Segoe UI" w:cs="Segoe UI"/>
-          <w:b/>
-          <w:color w:val="0D0D0D"/>
-        </w:rPr>
-      </w:pPr>
-      <w:r>
-        <w:rPr>
-          <w:rFonts w:ascii="Segoe UI" w:hAnsi="Segoe UI" w:cs="Segoe UI"/>
-          <w:b/>
-          <w:color w:val="0D0D0D"/>
-        </w:rPr>
-        <w:t>Attestation de Réception des Clés</w:t>
-      </w:r>
-    </w:p>
-    <w:p>
-      <w:pPr>
-        <w:pStyle w:val="NormalWeb"/>
-        <w:pBdr>
-          <w:top w:val="single" w:sz="2" w:space="0" w:color="E3E3E3"/>
-          <w:left w:val="single" w:sz="2" w:space="0" w:color="E3E3E3"/>
-          <w:bottom w:val="single" w:sz="2" w:space="0" w:color="E3E3E3"/>
-          <w:right w:val="single" w:sz="2" w:space="0" w:color="E3E3E3"/>
-        </w:pBdr>
-        <w:shd w:val="clear" w:color="auto" w:fill="FFFFFF"/>
-        <w:spacing w:before="300" w:beforeAutospacing="0" w:after="300" w:afterAutospacing="0"/>
-        <w:rPr>
-          <w:rFonts w:ascii="Segoe UI" w:hAnsi="Segoe UI" w:cs="Segoe UI"/>
-          <w:color w:val="0D0D0D"/>
-        </w:rPr>
-      </w:pPr>
-      <w:r>
-        <w:rPr>
-          <w:rFonts w:ascii="Segoe UI" w:hAnsi="Segoe UI" w:cs="Segoe UI"/>
-          <w:color w:val="0D0D0D"/>
-        </w:rPr>
-        <w:t xml:space="preserve">Je soussigné </w:t>
-      </w:r>
-      <w:proofErr w:type="gramStart"/>
-      <w:r>
-        <w:rPr>
-          <w:rFonts w:ascii="Segoe UI" w:hAnsi="Segoe UI" w:cs="Segoe UI"/>
-          <w:b/>
-          <w:color w:val="0D0D0D"/>
-        </w:rPr>
-        <w:t>M.RADI</w:t>
-      </w:r>
-      <w:proofErr w:type="gramEnd"/>
-      <w:r>
-        <w:rPr>
-          <w:rFonts w:ascii="Segoe UI" w:hAnsi="Segoe UI" w:cs="Segoe UI"/>
-          <w:b/>
-          <w:color w:val="0D0D0D"/>
-        </w:rPr>
-        <w:t xml:space="preserve"> Mohammed </w:t>
-      </w:r>
-      <w:proofErr w:type="spellStart"/>
-      <w:r>
-        <w:rPr>
-          <w:rFonts w:ascii="Segoe UI" w:hAnsi="Segoe UI" w:cs="Segoe UI"/>
-          <w:b/>
-          <w:color w:val="0D0D0D"/>
-        </w:rPr>
-        <w:t>Alaa</w:t>
-      </w:r>
-      <w:proofErr w:type="spellEnd"/>
-      <w:r>
-        <w:rPr>
-          <w:rFonts w:ascii="Segoe UI" w:hAnsi="Segoe UI" w:cs="Segoe UI"/>
-          <w:b/>
-          <w:color w:val="0D0D0D"/>
-        </w:rPr>
-        <w:t xml:space="preserve"> Eddine</w:t>
-      </w:r>
-      <w:r>
-        <w:rPr>
-          <w:rFonts w:ascii="Segoe UI" w:hAnsi="Segoe UI" w:cs="Segoe UI"/>
-          <w:color w:val="0D0D0D"/>
-        </w:rPr>
-        <w:t>, agissant en tant</w:t>
-      </w:r>
-      <w:r>
-        <w:rPr>
-          <w:rFonts w:ascii="Segoe UI" w:hAnsi="Segoe UI" w:cs="Segoe UI"/>
-          <w:color w:val="0D0D0D"/>
-        </w:rPr>
-        <w:t xml:space="preserve"> que</w:t>
-      </w:r>
-      <w:r>
-        <w:rPr>
-          <w:rFonts w:ascii="Segoe UI" w:hAnsi="Segoe UI" w:cs="Segoe UI"/>
-          <w:color w:val="0D0D0D"/>
-        </w:rPr>
-        <w:t xml:space="preserve"> Gérant</w:t>
-      </w:r>
-      <w:r>
-        <w:rPr>
-          <w:rFonts w:ascii="Segoe UI" w:hAnsi="Segoe UI" w:cs="Segoe UI"/>
-          <w:color w:val="0D0D0D"/>
-        </w:rPr>
-        <w:t xml:space="preserve"> au </w:t>
-      </w:r>
-      <w:r>
-        <w:rPr>
-          <w:rFonts w:ascii="Segoe UI" w:hAnsi="Segoe UI" w:cs="Segoe UI"/>
-          <w:color w:val="0D0D0D"/>
-        </w:rPr>
-        <w:t xml:space="preserve">sein de Pyramide </w:t>
-      </w:r>
-      <w:proofErr w:type="spellStart"/>
-      <w:proofErr w:type="gramStart"/>
-      <w:r>
-        <w:rPr>
-          <w:rFonts w:ascii="Segoe UI" w:hAnsi="Segoe UI" w:cs="Segoe UI"/>
-          <w:color w:val="0D0D0D"/>
-        </w:rPr>
-        <w:t>Immobiler</w:t>
-      </w:r>
-      <w:proofErr w:type="spellEnd"/>
-      <w:r>
-        <w:rPr>
-          <w:rFonts w:ascii="Segoe UI" w:hAnsi="Segoe UI" w:cs="Segoe UI"/>
-          <w:color w:val="0D0D0D"/>
-        </w:rPr>
-        <w:t xml:space="preserve"> ,</w:t>
-      </w:r>
-      <w:proofErr w:type="gramEnd"/>
-      <w:r>
-        <w:rPr>
-          <w:rFonts w:ascii="Segoe UI" w:hAnsi="Segoe UI" w:cs="Segoe UI"/>
-          <w:color w:val="0D0D0D"/>
-        </w:rPr>
-        <w:t xml:space="preserve"> att</w:t>
-      </w:r>
-      <w:r>
-        <w:rPr>
-          <w:rFonts w:ascii="Segoe UI" w:hAnsi="Segoe UI" w:cs="Segoe UI"/>
-          <w:color w:val="0D0D0D"/>
-        </w:rPr>
-        <w:t>este par la présente</w:t>
-      </w:r>
-      <w:r>
-        <w:rPr>
-          <w:rFonts w:ascii="Segoe UI" w:hAnsi="Segoe UI" w:cs="Segoe UI"/>
-          <w:color w:val="0D0D0D"/>
-        </w:rPr>
-        <w:t xml:space="preserve"> attestation</w:t>
-      </w:r>
-      <w:r>
-        <w:rPr>
-          <w:rFonts w:ascii="Segoe UI" w:hAnsi="Segoe UI" w:cs="Segoe UI"/>
-          <w:color w:val="0D0D0D"/>
-        </w:rPr>
-        <w:t xml:space="preserve"> avoir reçu</w:t>
-      </w:r>
-      <w:r>
-        <w:rPr>
-          <w:rFonts w:ascii="Segoe UI" w:hAnsi="Segoe UI" w:cs="Segoe UI"/>
-          <w:color w:val="0D0D0D"/>
-        </w:rPr>
-        <w:t xml:space="preserve"> les</w:t>
-      </w:r>
-      <w:r>
-        <w:rPr>
-          <w:rFonts w:ascii="Segoe UI" w:hAnsi="Segoe UI" w:cs="Segoe UI"/>
-          <w:color w:val="0D0D0D"/>
-        </w:rPr>
-        <w:t xml:space="preserve"> </w:t>
-      </w:r>
-      <w:r>
-        <w:rPr>
-          <w:rFonts w:ascii="Segoe UI" w:hAnsi="Segoe UI" w:cs="Segoe UI"/>
-          <w:color w:val="0D0D0D"/>
-        </w:rPr>
-        <w:t>clefs</w:t>
-      </w:r>
-      <w:r>
-        <w:rPr>
-          <w:rFonts w:ascii="Segoe UI" w:hAnsi="Segoe UI" w:cs="Segoe UI"/>
-          <w:color w:val="0D0D0D"/>
-        </w:rPr>
-        <w:t xml:space="preserve"> </w:t>
-      </w:r>
-      <w:r>
-        <w:rPr>
-          <w:rFonts w:ascii="Segoe UI" w:hAnsi="Segoe UI" w:cs="Segoe UI"/>
-          <w:color w:val="0D0D0D"/>
-        </w:rPr>
-        <w:t>d</w:t>
-      </w:r>
-      <w:r>
-        <w:rPr>
-          <w:rFonts w:ascii="Segoe UI" w:hAnsi="Segoe UI" w:cs="Segoe UI"/>
-          <w:color w:val="0D0D0D"/>
-        </w:rPr>
-        <w:t xml:space="preserve">e </w:t>
-      </w:r>
-      <w:r>
-        <w:rPr>
-          <w:rFonts w:ascii="Segoe UI" w:hAnsi="Segoe UI" w:cs="Segoe UI"/>
-          <w:color w:val="0D0D0D"/>
-        </w:rPr>
-        <w:t>L</w:t>
-      </w:r>
-      <w:r>
-        <w:rPr>
-          <w:rFonts w:ascii="Segoe UI" w:hAnsi="Segoe UI" w:cs="Segoe UI"/>
-          <w:color w:val="0D0D0D"/>
-        </w:rPr>
-        <w:t xml:space="preserve">’appartement F4 </w:t>
-      </w:r>
-      <w:proofErr w:type="spellStart"/>
-      <w:r>
-        <w:rPr>
-          <w:rFonts w:ascii="Segoe UI" w:hAnsi="Segoe UI" w:cs="Segoe UI"/>
-          <w:color w:val="0D0D0D"/>
-        </w:rPr>
-        <w:t>residence</w:t>
-      </w:r>
-      <w:proofErr w:type="spellEnd"/>
-      <w:r>
-        <w:rPr>
-          <w:rFonts w:ascii="Segoe UI" w:hAnsi="Segoe UI" w:cs="Segoe UI"/>
-          <w:color w:val="0D0D0D"/>
-        </w:rPr>
-        <w:t xml:space="preserve"> (</w:t>
-      </w:r>
-      <w:proofErr w:type="spellStart"/>
-      <w:r>
-        <w:rPr>
-          <w:rFonts w:ascii="Segoe UI" w:hAnsi="Segoe UI" w:cs="Segoe UI"/>
-          <w:color w:val="0D0D0D"/>
-        </w:rPr>
-        <w:t>antares</w:t>
-      </w:r>
-      <w:proofErr w:type="spellEnd"/>
-      <w:r>
-        <w:rPr>
-          <w:rFonts w:ascii="Segoe UI" w:hAnsi="Segoe UI" w:cs="Segoe UI"/>
-          <w:color w:val="0D0D0D"/>
-        </w:rPr>
-        <w:t>)</w:t>
-      </w:r>
-    </w:p>
-    <w:p>
-      <w:pPr>
-        <w:pStyle w:val="NormalWeb"/>
-        <w:pBdr>
-          <w:top w:val="single" w:sz="2" w:space="0" w:color="E3E3E3"/>
-          <w:left w:val="single" w:sz="2" w:space="0" w:color="E3E3E3"/>
-          <w:bottom w:val="single" w:sz="2" w:space="0" w:color="E3E3E3"/>
-          <w:right w:val="single" w:sz="2" w:space="0" w:color="E3E3E3"/>
-        </w:pBdr>
-        <w:shd w:val="clear" w:color="auto" w:fill="FFFFFF"/>
-        <w:spacing w:before="300" w:beforeAutospacing="0" w:after="300" w:afterAutospacing="0"/>
-        <w:rPr>
-          <w:rFonts w:ascii="Segoe UI" w:hAnsi="Segoe UI" w:cs="Segoe UI"/>
-          <w:color w:val="0D0D0D"/>
-        </w:rPr>
-      </w:pPr>
-      <w:r>
-        <w:rPr>
-          <w:rFonts w:ascii="Segoe UI" w:hAnsi="Segoe UI" w:cs="Segoe UI"/>
-          <w:color w:val="0D0D0D"/>
-        </w:rPr>
-        <w:t>Les clés ont été remises par</w:t>
-      </w:r>
-      <w:r>
-        <w:rPr>
-          <w:rFonts w:ascii="Segoe UI" w:hAnsi="Segoe UI" w:cs="Segoe UI"/>
-          <w:color w:val="0D0D0D"/>
-        </w:rPr>
-        <w:t xml:space="preserve"> </w:t>
-      </w:r>
-      <w:proofErr w:type="spellStart"/>
-      <w:r>
-        <w:rPr>
-          <w:rFonts w:ascii="Segoe UI" w:hAnsi="Segoe UI" w:cs="Segoe UI"/>
-          <w:b/>
-          <w:bCs/>
-          <w:color w:val="0D0D0D"/>
-        </w:rPr>
-        <w:t>gasmi</w:t>
-      </w:r>
-      <w:proofErr w:type="spellEnd"/>
-      <w:r>
-        <w:rPr>
-          <w:rFonts w:ascii="Segoe UI" w:hAnsi="Segoe UI" w:cs="Segoe UI"/>
-          <w:b/>
-          <w:bCs/>
-          <w:color w:val="0D0D0D"/>
-        </w:rPr>
-        <w:t xml:space="preserve"> </w:t>
-      </w:r>
-      <w:proofErr w:type="spellStart"/>
-      <w:r>
-        <w:rPr>
-          <w:rFonts w:ascii="Segoe UI" w:hAnsi="Segoe UI" w:cs="Segoe UI"/>
-          <w:b/>
-          <w:bCs/>
-          <w:color w:val="0D0D0D"/>
-        </w:rPr>
-        <w:t>amel</w:t>
-      </w:r>
-      <w:proofErr w:type="spellEnd"/>
-      <w:r>
-        <w:rPr>
-          <w:rFonts w:ascii="Segoe UI" w:hAnsi="Segoe UI" w:cs="Segoe UI"/>
-          <w:b/>
-          <w:bCs/>
-          <w:color w:val="0D0D0D"/>
-        </w:rPr>
-        <w:t xml:space="preserve"> </w:t>
-      </w:r>
-      <w:proofErr w:type="spellStart"/>
-      <w:r>
-        <w:rPr>
-          <w:rFonts w:ascii="Segoe UI" w:hAnsi="Segoe UI" w:cs="Segoe UI"/>
-          <w:b/>
-          <w:bCs/>
-          <w:color w:val="0D0D0D"/>
-        </w:rPr>
-        <w:t>ismahene</w:t>
-      </w:r>
-      <w:proofErr w:type="spellEnd"/>
-      <w:r>
-        <w:rPr>
-          <w:rFonts w:ascii="Segoe UI" w:hAnsi="Segoe UI" w:cs="Segoe UI"/>
-          <w:b/>
-          <w:bCs/>
-          <w:color w:val="0D0D0D"/>
-        </w:rPr>
-        <w:t xml:space="preserve"> </w:t>
-      </w:r>
-      <w:r>
-        <w:rPr>
-          <w:rFonts w:ascii="Segoe UI" w:hAnsi="Segoe UI" w:cs="Segoe UI"/>
-          <w:color w:val="0D0D0D"/>
-        </w:rPr>
-        <w:t>Le</w:t>
-      </w:r>
-      <w:r>
-        <w:rPr>
-          <w:rFonts w:ascii="Segoe UI" w:hAnsi="Segoe UI" w:cs="Segoe UI"/>
-          <w:color w:val="0D0D0D"/>
-        </w:rPr>
-        <w:t xml:space="preserve"> </w:t>
-      </w:r>
-      <w:r>
-        <w:rPr>
-          <w:rFonts w:ascii="Segoe UI" w:hAnsi="Segoe UI" w:cs="Segoe UI"/>
-          <w:color w:val="0D0D0D"/>
-        </w:rPr>
-        <w:t>04/12</w:t>
-      </w:r>
-      <w:r>
-        <w:rPr>
-          <w:rFonts w:ascii="Segoe UI" w:hAnsi="Segoe UI" w:cs="Segoe UI"/>
-          <w:color w:val="0D0D0D"/>
-        </w:rPr>
-        <w:t>/</w:t>
-      </w:r>
-      <w:r>
-        <w:rPr>
-          <w:rFonts w:ascii="Segoe UI" w:hAnsi="Segoe UI" w:cs="Segoe UI"/>
-          <w:color w:val="0D0D0D"/>
-        </w:rPr>
-        <w:t>25</w:t>
-      </w:r>
-      <w:r>
-        <w:rPr>
-          <w:rFonts w:ascii="Segoe UI" w:hAnsi="Segoe UI" w:cs="Segoe UI"/>
-          <w:color w:val="0D0D0D"/>
-        </w:rPr>
-        <w:t xml:space="preserve"> J'ai personnellement vérifié l'état des clés ainsi que leur correspondance avec les serrures du bien immobilier en question.</w:t>
-      </w:r>
-    </w:p>
-    <w:p>
-      <w:pPr>
-        <w:pStyle w:val="NormalWeb"/>
-        <w:pBdr>
-          <w:top w:val="single" w:sz="2" w:space="0" w:color="E3E3E3"/>
-          <w:left w:val="single" w:sz="2" w:space="0" w:color="E3E3E3"/>
-          <w:bottom w:val="single" w:sz="2" w:space="0" w:color="E3E3E3"/>
-          <w:right w:val="single" w:sz="2" w:space="0" w:color="E3E3E3"/>
-        </w:pBdr>
-        <w:shd w:val="clear" w:color="auto" w:fill="FFFFFF"/>
-        <w:spacing w:before="300" w:beforeAutospacing="0" w:after="300" w:afterAutospacing="0"/>
-        <w:rPr>
-          <w:rFonts w:ascii="Segoe UI" w:hAnsi="Segoe UI" w:cs="Segoe UI"/>
-          <w:color w:val="0D0D0D"/>
-        </w:rPr>
-      </w:pPr>
-      <w:r>
-        <w:rPr>
-          <w:rFonts w:ascii="Segoe UI" w:hAnsi="Segoe UI" w:cs="Segoe UI"/>
-          <w:color w:val="0D0D0D"/>
-        </w:rPr>
-        <w:t>Je m'engage à prendre toutes les mesures nécessaires pour assurer la sécurité des clés et du bien immobilier associé, conformément aux accords convenus entre toutes les parties concernées.</w:t>
-      </w:r>
-    </w:p>
-    <w:p>
-      <w:pPr>
-        <w:pStyle w:val="NormalWeb"/>
-        <w:pBdr>
-          <w:top w:val="single" w:sz="2" w:space="0" w:color="E3E3E3"/>
-          <w:left w:val="single" w:sz="2" w:space="0" w:color="E3E3E3"/>
-          <w:bottom w:val="single" w:sz="2" w:space="0" w:color="E3E3E3"/>
-          <w:right w:val="single" w:sz="2" w:space="0" w:color="E3E3E3"/>
-        </w:pBdr>
-        <w:shd w:val="clear" w:color="auto" w:fill="FFFFFF"/>
-        <w:spacing w:before="300" w:beforeAutospacing="0" w:after="300" w:afterAutospacing="0"/>
-        <w:rPr>
-          <w:rFonts w:ascii="Segoe UI" w:hAnsi="Segoe UI" w:cs="Segoe UI"/>
-          <w:color w:val="0D0D0D"/>
-        </w:rPr>
-      </w:pPr>
-      <w:r>
-        <w:rPr>
-          <w:rFonts w:ascii="Segoe UI" w:hAnsi="Segoe UI" w:cs="Segoe UI"/>
-          <w:color w:val="0D0D0D"/>
-        </w:rPr>
-        <w:t>Je certifie également que lesdites clés seront utilisées exclusivement dans le cadre des activités professionnelles liées à la gestion immobilière, et ne seront en aucun cas copiées ou utilisées à des fins personnelles.</w:t>
-      </w:r>
-    </w:p>
-    <w:p>
-      <w:pPr>
-        <w:pStyle w:val="NormalWeb"/>
-        <w:pBdr>
-          <w:top w:val="single" w:sz="2" w:space="0" w:color="E3E3E3"/>
-          <w:left w:val="single" w:sz="2" w:space="0" w:color="E3E3E3"/>
-          <w:bottom w:val="single" w:sz="2" w:space="0" w:color="E3E3E3"/>
-          <w:right w:val="single" w:sz="2" w:space="0" w:color="E3E3E3"/>
-        </w:pBdr>
-        <w:shd w:val="clear" w:color="auto" w:fill="FFFFFF"/>
-        <w:spacing w:before="300" w:beforeAutospacing="0" w:after="300" w:afterAutospacing="0"/>
-        <w:jc w:val="right"/>
-        <w:rPr>
-          <w:b/>
-          <w:sz w:val="28"/>
-        </w:rPr>
-      </w:pPr>
-      <w:r>
-        <w:rPr>
-          <w:rFonts w:ascii="Segoe UI" w:hAnsi="Segoe UI" w:cs="Segoe UI"/>
-          <w:b/>
-          <w:color w:val="0D0D0D"/>
-        </w:rPr>
-        <w:t>Fait à Oran le</w:t>
-      </w:r>
-      <w:r>
-        <w:rPr>
-          <w:rFonts w:ascii="Segoe UI" w:hAnsi="Segoe UI" w:cs="Segoe UI"/>
-          <w:b/>
-          <w:color w:val="0D0D0D"/>
-        </w:rPr>
-        <w:t xml:space="preserve"> </w:t>
-      </w:r>
-      <w:r>
-        <w:rPr>
-          <w:rFonts w:ascii="Segoe UI" w:hAnsi="Segoe UI" w:cs="Segoe UI"/>
-          <w:b/>
-          <w:color w:val="0D0D0D"/>
-        </w:rPr>
-        <w:t>04/12</w:t>
-      </w:r>
-      <w:r>
-        <w:rPr>
-          <w:rFonts w:ascii="Segoe UI" w:hAnsi="Segoe UI" w:cs="Segoe UI"/>
-          <w:b/>
-          <w:color w:val="0D0D0D"/>
-        </w:rPr>
-        <w:t>/25</w:t>
-      </w:r>
-    </w:p>
-    <w:p>
-      <w:pPr>
-        <w:jc w:val="right"/>
-        <w:rPr>
-          <w:b/>
-          <w:sz w:val="28"/>
-        </w:rPr>
-      </w:pPr>
-      <w:r>
-        <w:rPr>
-          <w:b/>
-          <w:sz w:val="28"/>
-        </w:rPr>
-        <w:t>Le Gérant</w:t>
-      </w:r>
-    </w:p>
-    <w:p/>
+    <w:tbl>
+      <w:tblPr>
+        <w:tblW w:w="9700" w:type="dxa"/>
+      </w:tblPr>
+      <w:tblGrid>
+        <w:gridCol w:w="4850"/>
+        <w:gridCol w:w="4850"/>
+      </w:tblGrid>
+      <w:tr>
+        <w:tc>
+          <w:tcPr>
+            <w:tcW w:w="4850" w:type="dxa"/>
+            <w:tcMar>
+              <w:top w:w="100" w:type="dxa"/>
+              <w:left w:w="120" w:type="dxa"/>
+              <w:bottom w:w="100" w:type="dxa"/>
+              <w:right w:w="120" w:type="dxa"/>
+            </w:tcMar>
+            <w:vAlign w:val="center"/>
+          </w:tcPr>
+          <w:p>
+            <w:pPr>
+              <w:spacing w:after="120"/>
+            </w:pPr>
+            <w:r>
+              <w:rPr>
+                <w:rFonts w:ascii="Arial" w:hAnsi="Arial"/>
+                <w:sz w:val="21"/>
+                <w:b/>
+              </w:rPr>
+              <w:t xml:space="preserve">Signature du client ou cocontractant
+</w:t>
+            </w:r>
+          </w:p>
+        </w:tc>
+        <w:tc>
+          <w:tcPr>
+            <w:tcW w:w="4850" w:type="dxa"/>
+            <w:tcMar>
+              <w:top w:w="100" w:type="dxa"/>
+              <w:left w:w="120" w:type="dxa"/>
+              <w:bottom w:w="100" w:type="dxa"/>
+              <w:right w:w="120" w:type="dxa"/>
+            </w:tcMar>
+            <w:vAlign w:val="center"/>
+          </w:tcPr>
+          <w:p>
+            <w:pPr>
+              <w:spacing w:after="120"/>
+            </w:pPr>
+            <w:r>
+              <w:rPr>
+                <w:rFonts w:ascii="Arial" w:hAnsi="Arial"/>
+                <w:sz w:val="21"/>
+                <w:b/>
+              </w:rPr>
+              <w:t xml:space="preserve">Cachet et signature de l’agence
+</w:t>
+            </w:r>
+          </w:p>
+        </w:tc>
+      </w:tr>
+    </w:tbl>
     <w:sectPr>
-      <w:headerReference w:type="default" r:id="rId8"/>
-      <w:pgSz w:w="11906" w:h="16838"/>
-      <w:pgMar w:top="1417" w:right="1417" w:bottom="1417" w:left="1417" w:header="708" w:footer="708" w:gutter="0"/>
-      <w:cols w:space="708"/>
-      <w:docGrid w:linePitch="360"/>
+      <w:pgSz w:w="12240" w:h="15840"/>
+      <w:pgMar w:top="1020" w:right="1134" w:bottom="1020" w:left="1134" w:header="720" w:footer="720" w:gutter="0"/>
     </w:sectPr>
   </w:body>
 </w:document>
@@ -767,6 +528,36 @@
     </w:p>
   </w:endnote>
 </w:endnotes>
+</file>
+
+<file path=word/footer1.xml><?xml version="1.0" encoding="utf-8"?>
+<w:ftr xmlns:wpc="http://schemas.microsoft.com/office/word/2010/wordprocessingCanvas" xmlns:cx="http://schemas.microsoft.com/office/drawing/2014/chartex" xmlns:cx1="http://schemas.microsoft.com/office/drawing/2015/9/8/chartex" xmlns:cx2="http://schemas.microsoft.com/office/drawing/2015/10/21/chartex" xmlns:cx3="http://schemas.microsoft.com/office/drawing/2016/5/9/chartex" xmlns:cx4="http://schemas.microsoft.com/office/drawing/2016/5/10/chartex" xmlns:cx5="http://schemas.microsoft.com/office/drawing/2016/5/11/chartex" xmlns:cx6="http://schemas.microsoft.com/office/drawing/2016/5/12/chartex" xmlns:cx7="http://schemas.microsoft.com/office/drawing/2016/5/13/chartex" xmlns:cx8="http://schemas.microsoft.com/office/drawing/2016/5/14/chartex" xmlns:mc="http://schemas.openxmlformats.org/markup-compatibility/2006" xmlns:aink="http://schemas.microsoft.com/office/drawing/2016/ink" xmlns:am3d="http://schemas.microsoft.com/office/drawing/2017/model3d" xmlns:o="urn:schemas-microsoft-com:office:office" xmlns:oel="http://schemas.microsoft.com/office/2019/extlst" xmlns:r="http://schemas.openxmlformats.org/officeDocument/2006/relationships" xmlns:m="http://schemas.openxmlformats.org/officeDocument/2006/math" xmlns:v="urn:schemas-microsoft-com:vml" xmlns:wp14="http://schemas.microsoft.com/office/word/2010/wordprocessingDrawing" xmlns:wp="http://schemas.openxmlformats.org/drawingml/2006/wordprocessingDrawing" xmlns:w10="urn:schemas-microsoft-com:office:word" xmlns:w="http://schemas.openxmlformats.org/wordprocessingml/2006/main" xmlns:w14="http://schemas.microsoft.com/office/word/2010/wordml" xmlns:w15="http://schemas.microsoft.com/office/word/2012/wordml" xmlns:w16cex="http://schemas.microsoft.com/office/word/2018/wordml/cex" xmlns:w16cid="http://schemas.microsoft.com/office/word/2016/wordml/cid" xmlns:w16="http://schemas.microsoft.com/office/word/2018/wordml" xmlns:w16du="http://schemas.microsoft.com/office/word/2023/wordml/word16du" xmlns:w16sdtdh="http://schemas.microsoft.com/office/word/2020/wordml/sdtdatahash" xmlns:w16sdtfl="http://schemas.microsoft.com/office/word/2024/wordml/sdtformatlock" xmlns:w16se="http://schemas.microsoft.com/office/word/2015/wordml/symex" xmlns:wpg="http://schemas.microsoft.com/office/word/2010/wordprocessingGroup" xmlns:wpi="http://schemas.microsoft.com/office/word/2010/wordprocessingInk" xmlns:wne="http://schemas.microsoft.com/office/word/2006/wordml" xmlns:wps="http://schemas.microsoft.com/office/word/2010/wordprocessingShape" mc:Ignorable="w14 w15 w16se w16cid w16 w16cex w16sdtdh w16sdtfl w16du wp14">
+  <w:p>
+    <w:pPr>
+      <w:pStyle w:val="Pieddepage"/>
+    </w:pPr>
+  </w:p>
+</w:ftr>
+</file>
+
+<file path=word/footer2.xml><?xml version="1.0" encoding="utf-8"?>
+<w:ftr xmlns:wpc="http://schemas.microsoft.com/office/word/2010/wordprocessingCanvas" xmlns:cx="http://schemas.microsoft.com/office/drawing/2014/chartex" xmlns:cx1="http://schemas.microsoft.com/office/drawing/2015/9/8/chartex" xmlns:cx2="http://schemas.microsoft.com/office/drawing/2015/10/21/chartex" xmlns:cx3="http://schemas.microsoft.com/office/drawing/2016/5/9/chartex" xmlns:cx4="http://schemas.microsoft.com/office/drawing/2016/5/10/chartex" xmlns:cx5="http://schemas.microsoft.com/office/drawing/2016/5/11/chartex" xmlns:cx6="http://schemas.microsoft.com/office/drawing/2016/5/12/chartex" xmlns:cx7="http://schemas.microsoft.com/office/drawing/2016/5/13/chartex" xmlns:cx8="http://schemas.microsoft.com/office/drawing/2016/5/14/chartex" xmlns:mc="http://schemas.openxmlformats.org/markup-compatibility/2006" xmlns:aink="http://schemas.microsoft.com/office/drawing/2016/ink" xmlns:am3d="http://schemas.microsoft.com/office/drawing/2017/model3d" xmlns:o="urn:schemas-microsoft-com:office:office" xmlns:oel="http://schemas.microsoft.com/office/2019/extlst" xmlns:r="http://schemas.openxmlformats.org/officeDocument/2006/relationships" xmlns:m="http://schemas.openxmlformats.org/officeDocument/2006/math" xmlns:v="urn:schemas-microsoft-com:vml" xmlns:wp14="http://schemas.microsoft.com/office/word/2010/wordprocessingDrawing" xmlns:wp="http://schemas.openxmlformats.org/drawingml/2006/wordprocessingDrawing" xmlns:w10="urn:schemas-microsoft-com:office:word" xmlns:w="http://schemas.openxmlformats.org/wordprocessingml/2006/main" xmlns:w14="http://schemas.microsoft.com/office/word/2010/wordml" xmlns:w15="http://schemas.microsoft.com/office/word/2012/wordml" xmlns:w16cex="http://schemas.microsoft.com/office/word/2018/wordml/cex" xmlns:w16cid="http://schemas.microsoft.com/office/word/2016/wordml/cid" xmlns:w16="http://schemas.microsoft.com/office/word/2018/wordml" xmlns:w16du="http://schemas.microsoft.com/office/word/2023/wordml/word16du" xmlns:w16sdtdh="http://schemas.microsoft.com/office/word/2020/wordml/sdtdatahash" xmlns:w16sdtfl="http://schemas.microsoft.com/office/word/2024/wordml/sdtformatlock" xmlns:w16se="http://schemas.microsoft.com/office/word/2015/wordml/symex" xmlns:wpg="http://schemas.microsoft.com/office/word/2010/wordprocessingGroup" xmlns:wpi="http://schemas.microsoft.com/office/word/2010/wordprocessingInk" xmlns:wne="http://schemas.microsoft.com/office/word/2006/wordml" xmlns:wps="http://schemas.microsoft.com/office/word/2010/wordprocessingShape" mc:Ignorable="w14 w15 w16se w16cid w16 w16cex w16sdtdh w16sdtfl w16du wp14">
+  <w:p>
+    <w:pPr>
+      <w:pStyle w:val="Pieddepage"/>
+    </w:pPr>
+  </w:p>
+</w:ftr>
+</file>
+
+<file path=word/footer3.xml><?xml version="1.0" encoding="utf-8"?>
+<w:ftr xmlns:wpc="http://schemas.microsoft.com/office/word/2010/wordprocessingCanvas" xmlns:cx="http://schemas.microsoft.com/office/drawing/2014/chartex" xmlns:cx1="http://schemas.microsoft.com/office/drawing/2015/9/8/chartex" xmlns:cx2="http://schemas.microsoft.com/office/drawing/2015/10/21/chartex" xmlns:cx3="http://schemas.microsoft.com/office/drawing/2016/5/9/chartex" xmlns:cx4="http://schemas.microsoft.com/office/drawing/2016/5/10/chartex" xmlns:cx5="http://schemas.microsoft.com/office/drawing/2016/5/11/chartex" xmlns:cx6="http://schemas.microsoft.com/office/drawing/2016/5/12/chartex" xmlns:cx7="http://schemas.microsoft.com/office/drawing/2016/5/13/chartex" xmlns:cx8="http://schemas.microsoft.com/office/drawing/2016/5/14/chartex" xmlns:mc="http://schemas.openxmlformats.org/markup-compatibility/2006" xmlns:aink="http://schemas.microsoft.com/office/drawing/2016/ink" xmlns:am3d="http://schemas.microsoft.com/office/drawing/2017/model3d" xmlns:o="urn:schemas-microsoft-com:office:office" xmlns:oel="http://schemas.microsoft.com/office/2019/extlst" xmlns:r="http://schemas.openxmlformats.org/officeDocument/2006/relationships" xmlns:m="http://schemas.openxmlformats.org/officeDocument/2006/math" xmlns:v="urn:schemas-microsoft-com:vml" xmlns:wp14="http://schemas.microsoft.com/office/word/2010/wordprocessingDrawing" xmlns:wp="http://schemas.openxmlformats.org/drawingml/2006/wordprocessingDrawing" xmlns:w10="urn:schemas-microsoft-com:office:word" xmlns:w="http://schemas.openxmlformats.org/wordprocessingml/2006/main" xmlns:w14="http://schemas.microsoft.com/office/word/2010/wordml" xmlns:w15="http://schemas.microsoft.com/office/word/2012/wordml" xmlns:w16cex="http://schemas.microsoft.com/office/word/2018/wordml/cex" xmlns:w16cid="http://schemas.microsoft.com/office/word/2016/wordml/cid" xmlns:w16="http://schemas.microsoft.com/office/word/2018/wordml" xmlns:w16du="http://schemas.microsoft.com/office/word/2023/wordml/word16du" xmlns:w16sdtdh="http://schemas.microsoft.com/office/word/2020/wordml/sdtdatahash" xmlns:w16sdtfl="http://schemas.microsoft.com/office/word/2024/wordml/sdtformatlock" xmlns:w16se="http://schemas.microsoft.com/office/word/2015/wordml/symex" xmlns:wpg="http://schemas.microsoft.com/office/word/2010/wordprocessingGroup" xmlns:wpi="http://schemas.microsoft.com/office/word/2010/wordprocessingInk" xmlns:wne="http://schemas.microsoft.com/office/word/2006/wordml" xmlns:wps="http://schemas.microsoft.com/office/word/2010/wordprocessingShape" mc:Ignorable="w14 w15 w16se w16cid w16 w16cex w16sdtdh w16sdtfl w16du wp14">
+  <w:p>
+    <w:pPr>
+      <w:pStyle w:val="Pieddepage"/>
+    </w:pPr>
+  </w:p>
+</w:ftr>
 </file>
 
 <file path=word/footnotes.xml><?xml version="1.0" encoding="utf-8"?>
@@ -799,6 +590,16 @@
   <w:p>
     <w:pPr>
       <w:pStyle w:val="En-tte"/>
+    </w:pPr>
+  </w:p>
+</w:hdr>
+</file>
+
+<file path=word/header2.xml><?xml version="1.0" encoding="utf-8"?>
+<w:hdr xmlns:wpc="http://schemas.microsoft.com/office/word/2010/wordprocessingCanvas" xmlns:cx="http://schemas.microsoft.com/office/drawing/2014/chartex" xmlns:cx1="http://schemas.microsoft.com/office/drawing/2015/9/8/chartex" xmlns:cx2="http://schemas.microsoft.com/office/drawing/2015/10/21/chartex" xmlns:cx3="http://schemas.microsoft.com/office/drawing/2016/5/9/chartex" xmlns:cx4="http://schemas.microsoft.com/office/drawing/2016/5/10/chartex" xmlns:cx5="http://schemas.microsoft.com/office/drawing/2016/5/11/chartex" xmlns:cx6="http://schemas.microsoft.com/office/drawing/2016/5/12/chartex" xmlns:cx7="http://schemas.microsoft.com/office/drawing/2016/5/13/chartex" xmlns:cx8="http://schemas.microsoft.com/office/drawing/2016/5/14/chartex" xmlns:mc="http://schemas.openxmlformats.org/markup-compatibility/2006" xmlns:aink="http://schemas.microsoft.com/office/drawing/2016/ink" xmlns:am3d="http://schemas.microsoft.com/office/drawing/2017/model3d" xmlns:o="urn:schemas-microsoft-com:office:office" xmlns:oel="http://schemas.microsoft.com/office/2019/extlst" xmlns:r="http://schemas.openxmlformats.org/officeDocument/2006/relationships" xmlns:m="http://schemas.openxmlformats.org/officeDocument/2006/math" xmlns:v="urn:schemas-microsoft-com:vml" xmlns:wp14="http://schemas.microsoft.com/office/word/2010/wordprocessingDrawing" xmlns:wp="http://schemas.openxmlformats.org/drawingml/2006/wordprocessingDrawing" xmlns:w10="urn:schemas-microsoft-com:office:word" xmlns:w="http://schemas.openxmlformats.org/wordprocessingml/2006/main" xmlns:w14="http://schemas.microsoft.com/office/word/2010/wordml" xmlns:w15="http://schemas.microsoft.com/office/word/2012/wordml" xmlns:w16cex="http://schemas.microsoft.com/office/word/2018/wordml/cex" xmlns:w16cid="http://schemas.microsoft.com/office/word/2016/wordml/cid" xmlns:w16="http://schemas.microsoft.com/office/word/2018/wordml" xmlns:w16du="http://schemas.microsoft.com/office/word/2023/wordml/word16du" xmlns:w16sdtdh="http://schemas.microsoft.com/office/word/2020/wordml/sdtdatahash" xmlns:w16sdtfl="http://schemas.microsoft.com/office/word/2024/wordml/sdtformatlock" xmlns:w16se="http://schemas.microsoft.com/office/word/2015/wordml/symex" xmlns:wpg="http://schemas.microsoft.com/office/word/2010/wordprocessingGroup" xmlns:wpi="http://schemas.microsoft.com/office/word/2010/wordprocessingInk" xmlns:wne="http://schemas.microsoft.com/office/word/2006/wordml" xmlns:wps="http://schemas.microsoft.com/office/word/2010/wordprocessingShape" mc:Ignorable="w14 w15 w16se w16cid w16 w16cex w16sdtdh w16sdtfl w16du wp14">
+  <w:p>
+    <w:pPr>
+      <w:pStyle w:val="En-tte"/>
       <w:jc w:val="center"/>
     </w:pPr>
     <w:r>
@@ -808,22 +609,22 @@
         <w:lang w:eastAsia="fr-FR"/>
       </w:rPr>
       <w:drawing>
-        <wp:anchor distT="0" distB="0" distL="114300" distR="114300" simplePos="0" relativeHeight="251659264" behindDoc="1" locked="0" layoutInCell="1" allowOverlap="1" wp14:anchorId="2B4AE886" wp14:editId="7A1B15F9">
+        <wp:anchor distT="0" distB="0" distL="114300" distR="114300" simplePos="0" relativeHeight="251659264" behindDoc="1" locked="0" layoutInCell="1" allowOverlap="1" wp14:anchorId="09581D24" wp14:editId="1462A83A">
           <wp:simplePos x="0" y="0"/>
-          <wp:positionH relativeFrom="margin">
-            <wp:align>center</wp:align>
+          <wp:positionH relativeFrom="column">
+            <wp:posOffset>-756920</wp:posOffset>
           </wp:positionH>
           <wp:positionV relativeFrom="paragraph">
             <wp:posOffset>-449580</wp:posOffset>
           </wp:positionV>
-          <wp:extent cx="1981200" cy="1851025"/>
+          <wp:extent cx="1774190" cy="1657985"/>
           <wp:effectExtent l="0" t="0" r="0" b="0"/>
           <wp:wrapTight wrapText="bothSides">
             <wp:wrapPolygon edited="0">
               <wp:start x="0" y="0"/>
-              <wp:lineTo x="0" y="21341"/>
-              <wp:lineTo x="21392" y="21341"/>
-              <wp:lineTo x="21392" y="0"/>
+              <wp:lineTo x="0" y="21344"/>
+              <wp:lineTo x="21337" y="21344"/>
+              <wp:lineTo x="21337" y="0"/>
               <wp:lineTo x="0" y="0"/>
             </wp:wrapPolygon>
           </wp:wrapTight>
@@ -856,7 +657,7 @@
                 <pic:spPr bwMode="auto">
                   <a:xfrm>
                     <a:off x="0" y="0"/>
-                    <a:ext cx="1981200" cy="1851025"/>
+                    <a:ext cx="1774190" cy="1657985"/>
                   </a:xfrm>
                   <a:prstGeom prst="rect">
                     <a:avLst/>
@@ -866,12 +667,6 @@
               </pic:pic>
             </a:graphicData>
           </a:graphic>
-          <wp14:sizeRelH relativeFrom="margin">
-            <wp14:pctWidth>0</wp14:pctWidth>
-          </wp14:sizeRelH>
-          <wp14:sizeRelV relativeFrom="margin">
-            <wp14:pctHeight>0</wp14:pctHeight>
-          </wp14:sizeRelV>
         </wp:anchor>
       </w:drawing>
     </w:r>
@@ -879,9 +674,19 @@
       <w:rPr>
         <w:sz w:val="72"/>
       </w:rPr>
-      <w:t xml:space="preserve"> </w:t>
+      <w:t>PYRAMIDE IMMOBILIER</w:t>
     </w:r>
   </w:p>
+  <w:p>
+    <w:pPr>
+      <w:pStyle w:val="En-tte"/>
+    </w:pPr>
+  </w:p>
+</w:hdr>
+</file>
+
+<file path=word/header3.xml><?xml version="1.0" encoding="utf-8"?>
+<w:hdr xmlns:wpc="http://schemas.microsoft.com/office/word/2010/wordprocessingCanvas" xmlns:cx="http://schemas.microsoft.com/office/drawing/2014/chartex" xmlns:cx1="http://schemas.microsoft.com/office/drawing/2015/9/8/chartex" xmlns:cx2="http://schemas.microsoft.com/office/drawing/2015/10/21/chartex" xmlns:cx3="http://schemas.microsoft.com/office/drawing/2016/5/9/chartex" xmlns:cx4="http://schemas.microsoft.com/office/drawing/2016/5/10/chartex" xmlns:cx5="http://schemas.microsoft.com/office/drawing/2016/5/11/chartex" xmlns:cx6="http://schemas.microsoft.com/office/drawing/2016/5/12/chartex" xmlns:cx7="http://schemas.microsoft.com/office/drawing/2016/5/13/chartex" xmlns:cx8="http://schemas.microsoft.com/office/drawing/2016/5/14/chartex" xmlns:mc="http://schemas.openxmlformats.org/markup-compatibility/2006" xmlns:aink="http://schemas.microsoft.com/office/drawing/2016/ink" xmlns:am3d="http://schemas.microsoft.com/office/drawing/2017/model3d" xmlns:o="urn:schemas-microsoft-com:office:office" xmlns:oel="http://schemas.microsoft.com/office/2019/extlst" xmlns:r="http://schemas.openxmlformats.org/officeDocument/2006/relationships" xmlns:m="http://schemas.openxmlformats.org/officeDocument/2006/math" xmlns:v="urn:schemas-microsoft-com:vml" xmlns:wp14="http://schemas.microsoft.com/office/word/2010/wordprocessingDrawing" xmlns:wp="http://schemas.openxmlformats.org/drawingml/2006/wordprocessingDrawing" xmlns:w10="urn:schemas-microsoft-com:office:word" xmlns:w="http://schemas.openxmlformats.org/wordprocessingml/2006/main" xmlns:w14="http://schemas.microsoft.com/office/word/2010/wordml" xmlns:w15="http://schemas.microsoft.com/office/word/2012/wordml" xmlns:w16cex="http://schemas.microsoft.com/office/word/2018/wordml/cex" xmlns:w16cid="http://schemas.microsoft.com/office/word/2016/wordml/cid" xmlns:w16="http://schemas.microsoft.com/office/word/2018/wordml" xmlns:w16du="http://schemas.microsoft.com/office/word/2023/wordml/word16du" xmlns:w16sdtdh="http://schemas.microsoft.com/office/word/2020/wordml/sdtdatahash" xmlns:w16sdtfl="http://schemas.microsoft.com/office/word/2024/wordml/sdtformatlock" xmlns:w16se="http://schemas.microsoft.com/office/word/2015/wordml/symex" xmlns:wpg="http://schemas.microsoft.com/office/word/2010/wordprocessingGroup" xmlns:wpi="http://schemas.microsoft.com/office/word/2010/wordprocessingInk" xmlns:wne="http://schemas.microsoft.com/office/word/2006/wordml" xmlns:wps="http://schemas.microsoft.com/office/word/2010/wordprocessingShape" mc:Ignorable="w14 w15 w16se w16cid w16 w16cex w16sdtdh w16sdtfl w16du wp14">
   <w:p>
     <w:pPr>
       <w:pStyle w:val="En-tte"/>
@@ -1118,10 +923,10 @@
       </w:pPr>
     </w:lvl>
   </w:abstractNum>
-  <w:num w:numId="1" w16cid:durableId="1675260230">
+  <w:num w:numId="1" w16cid:durableId="976647038">
     <w:abstractNumId w:val="1"/>
   </w:num>
-  <w:num w:numId="2" w16cid:durableId="1970817145">
+  <w:num w:numId="2" w16cid:durableId="1174608278">
     <w:abstractNumId w:val="0"/>
   </w:num>
 </w:numbering>
@@ -1627,21 +1432,14 @@
       <w:szCs w:val="18"/>
     </w:rPr>
   </w:style>
-  <w:style w:type="paragraph" w:styleId="NormalWeb">
-    <w:name w:val="Normal (Web)"/>
-    <w:basedOn w:val="Normal"/>
-    <w:uiPriority w:val="99"/>
-    <w:unhideWhenUsed/>
-    <w:rsid w:val="00337E89"/>
+  <w:style w:type="paragraph" w:styleId="Sansinterligne">
+    <w:name w:val="No Spacing"/>
+    <w:uiPriority w:val="1"/>
+    <w:qFormat/>
+    <w:rsid w:val="00003FD0"/>
     <w:pPr>
-      <w:spacing w:before="100" w:beforeAutospacing="1" w:after="100" w:afterAutospacing="1" w:line="240" w:lineRule="auto"/>
+      <w:spacing w:after="0" w:line="240" w:lineRule="auto"/>
     </w:pPr>
-    <w:rPr>
-      <w:rFonts w:ascii="Times New Roman" w:eastAsia="Times New Roman" w:hAnsi="Times New Roman" w:cs="Times New Roman"/>
-      <w:sz w:val="24"/>
-      <w:szCs w:val="24"/>
-      <w:lang w:eastAsia="fr-FR"/>
-    </w:rPr>
   </w:style>
 </w:styles>
 </file>
@@ -1912,7 +1710,7 @@
 </file>
 
 <file path=customXml/itemProps1.xml><?xml version="1.0" encoding="utf-8"?>
-<ds:datastoreItem xmlns:ds="http://schemas.openxmlformats.org/officeDocument/2006/customXml" ds:itemID="{AA3B7671-3B44-4C37-AEC0-B35C495315F8}">
+<ds:datastoreItem xmlns:ds="http://schemas.openxmlformats.org/officeDocument/2006/customXml" ds:itemID="{34012ADE-7B2B-4F2B-9B94-7B770DC076B2}">
   <ds:schemaRefs>
     <ds:schemaRef ds:uri="http://schemas.openxmlformats.org/officeDocument/2006/bibliography"/>
   </ds:schemaRefs>

</xml_diff>